<commit_message>
vault backup: 2026-04-21 10:04:36
</commit_message>
<xml_diff>
--- a/ccfund.docx
+++ b/ccfund.docx
@@ -10,15 +10,89 @@
         <w:t xml:space="preserve">ccfund</w:t>
       </w:r>
     </w:p>
+    <w:p>
+      <w:pPr>
+        <w:pStyle w:val="FirstParagraph"/>
+      </w:pPr>
+      <w:r>
+        <w:t xml:space="preserve">% </w:t>
+      </w:r>
+      <w:r>
+        <w:rPr>
+          <w:rFonts w:hint="eastAsia"/>
+        </w:rPr>
+        <w:t xml:space="preserve">技术文件名称：烽火台-专户营销页面需求说明书</w:t>
+      </w:r>
+      <w:r>
+        <w:br/>
+      </w:r>
+      <w:r>
+        <w:t xml:space="preserve">% </w:t>
+      </w:r>
+      <w:r>
+        <w:rPr>
+          <w:rFonts w:hint="eastAsia"/>
+        </w:rPr>
+        <w:t xml:space="preserve">技术文件编号：</w:t>
+      </w:r>
+      <w:r>
+        <w:br/>
+      </w:r>
+      <w:r>
+        <w:t xml:space="preserve">% </w:t>
+      </w:r>
+      <w:r>
+        <w:rPr>
+          <w:rFonts w:hint="eastAsia"/>
+        </w:rPr>
+        <w:t xml:space="preserve">版本：1.0</w:t>
+      </w:r>
+      <w:r>
+        <w:br/>
+      </w:r>
+      <w:r>
+        <w:t xml:space="preserve">% </w:t>
+      </w:r>
+      <w:r>
+        <w:rPr>
+          <w:rFonts w:hint="eastAsia"/>
+        </w:rPr>
+        <w:t xml:space="preserve">日期：2026-04-21</w:t>
+      </w:r>
+    </w:p>
+    <w:bookmarkStart w:id="11" w:name="技术文件"/>
+    <w:p>
+      <w:pPr>
+        <w:pStyle w:val="Heading1"/>
+      </w:pPr>
+      <w:r>
+        <w:rPr>
+          <w:rFonts w:hint="eastAsia"/>
+        </w:rPr>
+        <w:t xml:space="preserve">技术文件</w:t>
+      </w:r>
+    </w:p>
+    <w:bookmarkStart w:id="9" w:name="基本信息"/>
+    <w:p>
+      <w:pPr>
+        <w:pStyle w:val="Heading2"/>
+      </w:pPr>
+      <w:r>
+        <w:rPr>
+          <w:rFonts w:hint="eastAsia"/>
+        </w:rPr>
+        <w:t xml:space="preserve">基本信息</w:t>
+      </w:r>
+    </w:p>
     <w:tbl>
       <w:tblPr>
         <w:tblStyle w:val="Table"/>
-        <w:tblW w:type="pct" w:w="5000"/>
-        <w:tblLayout w:type="fixed"/>
+        <w:tblW w:type="auto" w:w="0"/>
         <w:tblLook w:firstRow="1" w:lastRow="0" w:firstColumn="0" w:lastColumn="0" w:noHBand="0" w:noVBand="0" w:val="0020"/>
       </w:tblPr>
       <w:tblGrid>
-        <w:gridCol w:w="7920"/>
+        <w:gridCol w:w="3960"/>
+        <w:gridCol w:w="3960"/>
       </w:tblGrid>
       <w:tr>
         <w:trPr>
@@ -30,6 +104,26 @@
             <w:pPr>
               <w:pStyle w:val="Compact"/>
             </w:pPr>
+            <w:r>
+              <w:rPr>
+                <w:rFonts w:hint="eastAsia"/>
+              </w:rPr>
+              <w:t xml:space="preserve">项目</w:t>
+            </w:r>
+          </w:p>
+        </w:tc>
+        <w:tc>
+          <w:tcPr/>
+          <w:p>
+            <w:pPr>
+              <w:pStyle w:val="Compact"/>
+            </w:pPr>
+            <w:r>
+              <w:rPr>
+                <w:rFonts w:hint="eastAsia"/>
+              </w:rPr>
+              <w:t xml:space="preserve">内容</w:t>
+            </w:r>
           </w:p>
         </w:tc>
       </w:tr>
@@ -43,245 +137,360 @@
             <w:r>
               <w:rPr>
                 <w:rFonts w:hint="eastAsia"/>
-                <w:b/>
-                <w:bCs/>
-              </w:rPr>
-              <w:t xml:space="preserve">技</w:t>
-            </w:r>
-            <w:r>
-              <w:rPr>
-                <w:b/>
-                <w:bCs/>
-              </w:rPr>
-              <w:t xml:space="preserve"> </w:t>
-            </w:r>
-            <w:r>
-              <w:rPr>
-                <w:rFonts w:hint="eastAsia"/>
-                <w:b/>
-                <w:bCs/>
-              </w:rPr>
-              <w:t xml:space="preserve">术</w:t>
-            </w:r>
-            <w:r>
-              <w:rPr>
-                <w:b/>
-                <w:bCs/>
-              </w:rPr>
-              <w:t xml:space="preserve"> </w:t>
-            </w:r>
-            <w:r>
-              <w:rPr>
-                <w:rFonts w:hint="eastAsia"/>
-                <w:b/>
-                <w:bCs/>
-              </w:rPr>
-              <w:t xml:space="preserve">文</w:t>
-            </w:r>
-            <w:r>
-              <w:rPr>
-                <w:b/>
-                <w:bCs/>
-              </w:rPr>
-              <w:t xml:space="preserve"> </w:t>
-            </w:r>
-            <w:r>
-              <w:rPr>
-                <w:rFonts w:hint="eastAsia"/>
-                <w:b/>
-                <w:bCs/>
-              </w:rPr>
-              <w:t xml:space="preserve">件</w:t>
-            </w:r>
-            <w:r>
-              <w:br/>
-            </w:r>
-            <w:r>
-              <w:br/>
-            </w:r>
-            <w:r>
-              <w:t xml:space="preserve">       </w:t>
-            </w:r>
-            <w:r>
-              <w:rPr>
-                <w:rFonts w:hint="eastAsia"/>
-              </w:rPr>
-              <w:t xml:space="preserve">技术文件名称：烽火台-专户营销页面</w:t>
-            </w:r>
-            <w:r>
-              <w:br/>
-            </w:r>
-            <w:r>
-              <w:br/>
-            </w:r>
-            <w:r>
-              <w:rPr>
-                <w:rFonts w:hint="eastAsia"/>
-              </w:rPr>
-              <w:t xml:space="preserve">需求说明书</w:t>
-            </w:r>
-            <w:r>
-              <w:br/>
-            </w:r>
-            <w:r>
-              <w:br/>
-            </w:r>
-            <w:r>
-              <w:rPr>
-                <w:rFonts w:hint="eastAsia"/>
-              </w:rPr>
-              <w:t xml:space="preserve">技术文件编号：</w:t>
-            </w:r>
-            <w:r>
-              <w:br/>
-            </w:r>
-            <w:r>
-              <w:br/>
-            </w:r>
-            <w:r>
-              <w:rPr>
-                <w:rFonts w:hint="eastAsia"/>
-              </w:rPr>
-              <w:t xml:space="preserve">版</w:t>
-            </w:r>
-            <w:r>
-              <w:t xml:space="preserve">        </w:t>
-            </w:r>
-            <w:r>
-              <w:rPr>
-                <w:rFonts w:hint="eastAsia"/>
-              </w:rPr>
-              <w:t xml:space="preserve">本：1.0</w:t>
-            </w:r>
-            <w:r>
-              <w:br/>
-            </w:r>
-            <w:r>
-              <w:br/>
-            </w:r>
-            <w:r>
-              <w:rPr>
-                <w:rFonts w:hint="eastAsia"/>
-              </w:rPr>
-              <w:t xml:space="preserve">拟</w:t>
-            </w:r>
-            <w:r>
-              <w:t xml:space="preserve">  </w:t>
-            </w:r>
-            <w:r>
-              <w:rPr>
-                <w:rFonts w:hint="eastAsia"/>
-              </w:rPr>
-              <w:t xml:space="preserve">制</w:t>
-            </w:r>
-            <w:r>
-              <w:t xml:space="preserve">                    </w:t>
-            </w:r>
-            <w:r>
-              <w:br/>
-            </w:r>
-            <w:r>
-              <w:br/>
-            </w:r>
-            <w:r>
-              <w:t xml:space="preserve">                      </w:t>
-            </w:r>
-            <w:r>
-              <w:rPr>
-                <w:rFonts w:hint="eastAsia"/>
-              </w:rPr>
-              <w:t xml:space="preserve">审</w:t>
-            </w:r>
-            <w:r>
-              <w:t xml:space="preserve">  </w:t>
-            </w:r>
-            <w:r>
-              <w:rPr>
-                <w:rFonts w:hint="eastAsia"/>
-              </w:rPr>
-              <w:t xml:space="preserve">核</w:t>
-            </w:r>
-            <w:r>
-              <w:t xml:space="preserve">                     </w:t>
-            </w:r>
-            <w:r>
-              <w:br/>
-            </w:r>
-            <w:r>
-              <w:br/>
-            </w:r>
-            <w:r>
-              <w:rPr>
-                <w:rFonts w:hint="eastAsia"/>
-              </w:rPr>
-              <w:t xml:space="preserve">会</w:t>
-            </w:r>
-            <w:r>
-              <w:t xml:space="preserve">  </w:t>
-            </w:r>
-            <w:r>
-              <w:rPr>
-                <w:rFonts w:hint="eastAsia"/>
-              </w:rPr>
-              <w:t xml:space="preserve">签</w:t>
-            </w:r>
-            <w:r>
-              <w:t xml:space="preserve">                     </w:t>
-            </w:r>
-            <w:r>
-              <w:br/>
-            </w:r>
-            <w:r>
-              <w:br/>
-            </w:r>
-            <w:r>
-              <w:t xml:space="preserve">                      </w:t>
-            </w:r>
-            <w:r>
-              <w:rPr>
-                <w:rFonts w:hint="eastAsia"/>
-              </w:rPr>
-              <w:t xml:space="preserve">标准化</w:t>
-            </w:r>
-            <w:r>
-              <w:t xml:space="preserve">                     </w:t>
-            </w:r>
-            <w:r>
-              <w:br/>
-            </w:r>
-            <w:r>
-              <w:br/>
-            </w:r>
-            <w:r>
-              <w:rPr>
-                <w:rFonts w:hint="eastAsia"/>
-              </w:rPr>
-              <w:t xml:space="preserve">批</w:t>
-            </w:r>
-            <w:r>
-              <w:t xml:space="preserve">  </w:t>
-            </w:r>
-            <w:r>
-              <w:rPr>
-                <w:rFonts w:hint="eastAsia"/>
-              </w:rPr>
-              <w:t xml:space="preserve">准</w:t>
+              </w:rPr>
+              <w:t xml:space="preserve">技术文件名称</w:t>
+            </w:r>
+          </w:p>
+        </w:tc>
+        <w:tc>
+          <w:tcPr/>
+          <w:p>
+            <w:pPr>
+              <w:pStyle w:val="Compact"/>
+            </w:pPr>
+            <w:r>
+              <w:rPr>
+                <w:rFonts w:hint="eastAsia"/>
+              </w:rPr>
+              <w:t xml:space="preserve">烽火台-专户营销页面需求说明书</w:t>
+            </w:r>
+          </w:p>
+        </w:tc>
+      </w:tr>
+      <w:tr>
+        <w:tc>
+          <w:tcPr/>
+          <w:p>
+            <w:pPr>
+              <w:pStyle w:val="Compact"/>
+            </w:pPr>
+            <w:r>
+              <w:rPr>
+                <w:rFonts w:hint="eastAsia"/>
+              </w:rPr>
+              <w:t xml:space="preserve">技术文件编号</w:t>
+            </w:r>
+          </w:p>
+        </w:tc>
+        <w:tc>
+          <w:tcPr/>
+          <w:p>
+            <w:pPr>
+              <w:pStyle w:val="Compact"/>
+            </w:pPr>
+          </w:p>
+        </w:tc>
+      </w:tr>
+      <w:tr>
+        <w:tc>
+          <w:tcPr/>
+          <w:p>
+            <w:pPr>
+              <w:pStyle w:val="Compact"/>
+            </w:pPr>
+            <w:r>
+              <w:rPr>
+                <w:rFonts w:hint="eastAsia"/>
+              </w:rPr>
+              <w:t xml:space="preserve">版本</w:t>
+            </w:r>
+          </w:p>
+        </w:tc>
+        <w:tc>
+          <w:tcPr/>
+          <w:p>
+            <w:pPr>
+              <w:pStyle w:val="Compact"/>
+            </w:pPr>
+            <w:r>
+              <w:t xml:space="preserve">1.0</w:t>
             </w:r>
           </w:p>
         </w:tc>
       </w:tr>
     </w:tbl>
-    <w:p>
-      <w:pPr>
-        <w:pStyle w:val="BodyText"/>
-      </w:pPr>
+    <w:bookmarkEnd w:id="9"/>
+    <w:bookmarkStart w:id="10" w:name="审批信息"/>
+    <w:p>
+      <w:pPr>
+        <w:pStyle w:val="Heading2"/>
+      </w:pPr>
+      <w:r>
+        <w:rPr>
+          <w:rFonts w:hint="eastAsia"/>
+        </w:rPr>
+        <w:t xml:space="preserve">审批信息</w:t>
+      </w:r>
+    </w:p>
+    <w:tbl>
+      <w:tblPr>
+        <w:tblStyle w:val="Table"/>
+        <w:tblW w:type="auto" w:w="0"/>
+        <w:tblLook w:firstRow="1" w:lastRow="0" w:firstColumn="0" w:lastColumn="0" w:noHBand="0" w:noVBand="0" w:val="0020"/>
+      </w:tblPr>
+      <w:tblGrid>
+        <w:gridCol w:w="2640"/>
+        <w:gridCol w:w="2640"/>
+        <w:gridCol w:w="2640"/>
+      </w:tblGrid>
+      <w:tr>
+        <w:trPr>
+          <w:tblHeader w:val="on"/>
+        </w:trPr>
+        <w:tc>
+          <w:tcPr/>
+          <w:p>
+            <w:pPr>
+              <w:pStyle w:val="Compact"/>
+            </w:pPr>
+            <w:r>
+              <w:rPr>
+                <w:rFonts w:hint="eastAsia"/>
+              </w:rPr>
+              <w:t xml:space="preserve">角色</w:t>
+            </w:r>
+          </w:p>
+        </w:tc>
+        <w:tc>
+          <w:tcPr/>
+          <w:p>
+            <w:pPr>
+              <w:pStyle w:val="Compact"/>
+            </w:pPr>
+            <w:r>
+              <w:rPr>
+                <w:rFonts w:hint="eastAsia"/>
+              </w:rPr>
+              <w:t xml:space="preserve">姓名</w:t>
+            </w:r>
+          </w:p>
+        </w:tc>
+        <w:tc>
+          <w:tcPr/>
+          <w:p>
+            <w:pPr>
+              <w:pStyle w:val="Compact"/>
+            </w:pPr>
+            <w:r>
+              <w:rPr>
+                <w:rFonts w:hint="eastAsia"/>
+              </w:rPr>
+              <w:t xml:space="preserve">日期</w:t>
+            </w:r>
+          </w:p>
+        </w:tc>
+      </w:tr>
+      <w:tr>
+        <w:tc>
+          <w:tcPr/>
+          <w:p>
+            <w:pPr>
+              <w:pStyle w:val="Compact"/>
+            </w:pPr>
+            <w:r>
+              <w:rPr>
+                <w:rFonts w:hint="eastAsia"/>
+              </w:rPr>
+              <w:t xml:space="preserve">拟制</w:t>
+            </w:r>
+          </w:p>
+        </w:tc>
+        <w:tc>
+          <w:tcPr/>
+          <w:p>
+            <w:pPr>
+              <w:pStyle w:val="Compact"/>
+            </w:pPr>
+          </w:p>
+        </w:tc>
+        <w:tc>
+          <w:tcPr/>
+          <w:p>
+            <w:pPr>
+              <w:pStyle w:val="Compact"/>
+            </w:pPr>
+          </w:p>
+        </w:tc>
+      </w:tr>
+      <w:tr>
+        <w:tc>
+          <w:tcPr/>
+          <w:p>
+            <w:pPr>
+              <w:pStyle w:val="Compact"/>
+            </w:pPr>
+            <w:r>
+              <w:rPr>
+                <w:rFonts w:hint="eastAsia"/>
+              </w:rPr>
+              <w:t xml:space="preserve">审核</w:t>
+            </w:r>
+          </w:p>
+        </w:tc>
+        <w:tc>
+          <w:tcPr/>
+          <w:p>
+            <w:pPr>
+              <w:pStyle w:val="Compact"/>
+            </w:pPr>
+          </w:p>
+        </w:tc>
+        <w:tc>
+          <w:tcPr/>
+          <w:p>
+            <w:pPr>
+              <w:pStyle w:val="Compact"/>
+            </w:pPr>
+          </w:p>
+        </w:tc>
+      </w:tr>
+      <w:tr>
+        <w:tc>
+          <w:tcPr/>
+          <w:p>
+            <w:pPr>
+              <w:pStyle w:val="Compact"/>
+            </w:pPr>
+            <w:r>
+              <w:rPr>
+                <w:rFonts w:hint="eastAsia"/>
+              </w:rPr>
+              <w:t xml:space="preserve">会签</w:t>
+            </w:r>
+          </w:p>
+        </w:tc>
+        <w:tc>
+          <w:tcPr/>
+          <w:p>
+            <w:pPr>
+              <w:pStyle w:val="Compact"/>
+            </w:pPr>
+          </w:p>
+        </w:tc>
+        <w:tc>
+          <w:tcPr/>
+          <w:p>
+            <w:pPr>
+              <w:pStyle w:val="Compact"/>
+            </w:pPr>
+          </w:p>
+        </w:tc>
+      </w:tr>
+      <w:tr>
+        <w:tc>
+          <w:tcPr/>
+          <w:p>
+            <w:pPr>
+              <w:pStyle w:val="Compact"/>
+            </w:pPr>
+            <w:r>
+              <w:rPr>
+                <w:rFonts w:hint="eastAsia"/>
+              </w:rPr>
+              <w:t xml:space="preserve">标准化</w:t>
+            </w:r>
+          </w:p>
+        </w:tc>
+        <w:tc>
+          <w:tcPr/>
+          <w:p>
+            <w:pPr>
+              <w:pStyle w:val="Compact"/>
+            </w:pPr>
+          </w:p>
+        </w:tc>
+        <w:tc>
+          <w:tcPr/>
+          <w:p>
+            <w:pPr>
+              <w:pStyle w:val="Compact"/>
+            </w:pPr>
+          </w:p>
+        </w:tc>
+      </w:tr>
+      <w:tr>
+        <w:tc>
+          <w:tcPr/>
+          <w:p>
+            <w:pPr>
+              <w:pStyle w:val="Compact"/>
+            </w:pPr>
+            <w:r>
+              <w:rPr>
+                <w:rFonts w:hint="eastAsia"/>
+              </w:rPr>
+              <w:t xml:space="preserve">批准</w:t>
+            </w:r>
+          </w:p>
+        </w:tc>
+        <w:tc>
+          <w:tcPr/>
+          <w:p>
+            <w:pPr>
+              <w:pStyle w:val="Compact"/>
+            </w:pPr>
+          </w:p>
+        </w:tc>
+        <w:tc>
+          <w:tcPr/>
+          <w:p>
+            <w:pPr>
+              <w:pStyle w:val="Compact"/>
+            </w:pPr>
+          </w:p>
+        </w:tc>
+      </w:tr>
+    </w:tbl>
+    <w:p>
+      <w:r>
+        <w:pict>
+          <v:rect style="width:0;height:1.5pt" o:hralign="center" o:hrstd="t" o:hr="t"/>
+        </w:pict>
+      </w:r>
+    </w:p>
+    <w:bookmarkEnd w:id="10"/>
+    <w:bookmarkEnd w:id="11"/>
+    <w:bookmarkStart w:id="12" w:name="版权声明"/>
+    <w:p>
+      <w:pPr>
+        <w:pStyle w:val="Heading1"/>
+      </w:pPr>
+      <w:r>
+        <w:rPr>
+          <w:rFonts w:hint="eastAsia"/>
+        </w:rPr>
+        <w:t xml:space="preserve">版权声明</w:t>
+      </w:r>
+    </w:p>
+    <w:p>
+      <w:pPr>
+        <w:pStyle w:val="FirstParagraph"/>
+      </w:pPr>
+      <w:r>
+        <w:rPr>
+          <w:rFonts w:hint="eastAsia"/>
+        </w:rPr>
+        <w:t xml:space="preserve">本文中的所有信息均为</w:t>
+      </w:r>
+      <w:r>
+        <w:t xml:space="preserve"> </w:t>
+      </w:r>
       <w:r>
         <w:rPr>
           <w:rFonts w:hint="eastAsia"/>
           <w:b/>
           <w:bCs/>
         </w:rPr>
-        <w:t xml:space="preserve">版权声明</w:t>
+        <w:t xml:space="preserve">xx基金管理有限公司</w:t>
+      </w:r>
+      <w:r>
+        <w:t xml:space="preserve"> </w:t>
+      </w:r>
+      <w:r>
+        <w:rPr>
+          <w:rFonts w:hint="eastAsia"/>
+        </w:rPr>
+        <w:t xml:space="preserve">秘密信息，务请妥善保管，未经公司明确作出的书面许可，不得为任何目的、以任何形式或手段（包括电子、机械、复印、录音或其他形式）对本文档的任何部分进行复制、存储、引入检索系统或者传播。</w:t>
       </w:r>
     </w:p>
     <w:p>
@@ -292,24 +501,11 @@
         <w:rPr>
           <w:rFonts w:hint="eastAsia"/>
         </w:rPr>
-        <w:t xml:space="preserve">本文中的所有信息均为长城基金管理有限公司秘密信息，务请妥善保管，未经公司明确作出的书面许可，不得为任何目的、以任何形式或手段（包括电子、机械、复印、录音或其他形式）对本文档的任何部分进行复制、存储、引入检索系统或者传播。</w:t>
-      </w:r>
-    </w:p>
-    <w:p>
-      <w:pPr>
-        <w:pStyle w:val="BodyText"/>
-      </w:pPr>
-      <w:r>
-        <w:rPr>
-          <w:rFonts w:hint="eastAsia"/>
-        </w:rPr>
-        <w:t xml:space="preserve">长城基金管理有限公司</w:t>
-      </w:r>
-    </w:p>
-    <w:p>
-      <w:pPr>
-        <w:pStyle w:val="BodyText"/>
-      </w:pPr>
+        <w:t xml:space="preserve">xx基金管理有限公司</w:t>
+      </w:r>
+      <w:r>
+        <w:br/>
+      </w:r>
       <w:r>
         <w:rPr>
           <w:rFonts w:hint="eastAsia"/>
@@ -318,8 +514,17 @@
       </w:r>
     </w:p>
     <w:p>
-      <w:pPr>
-        <w:pStyle w:val="BodyText"/>
+      <w:r>
+        <w:pict>
+          <v:rect style="width:0;height:1.5pt" o:hralign="center" o:hrstd="t" o:hr="t"/>
+        </w:pict>
+      </w:r>
+    </w:p>
+    <w:bookmarkEnd w:id="12"/>
+    <w:bookmarkStart w:id="13" w:name="修订历史记录"/>
+    <w:p>
+      <w:pPr>
+        <w:pStyle w:val="Heading1"/>
       </w:pPr>
       <w:r>
         <w:rPr>
@@ -350,30 +555,54 @@
             <w:pPr>
               <w:pStyle w:val="Compact"/>
             </w:pPr>
-          </w:p>
-        </w:tc>
-        <w:tc>
-          <w:tcPr/>
-          <w:p>
-            <w:pPr>
-              <w:pStyle w:val="Compact"/>
-            </w:pPr>
-          </w:p>
-        </w:tc>
-        <w:tc>
-          <w:tcPr/>
-          <w:p>
-            <w:pPr>
-              <w:pStyle w:val="Compact"/>
-            </w:pPr>
-          </w:p>
-        </w:tc>
-        <w:tc>
-          <w:tcPr/>
-          <w:p>
-            <w:pPr>
-              <w:pStyle w:val="Compact"/>
-            </w:pPr>
+            <w:r>
+              <w:rPr>
+                <w:rFonts w:hint="eastAsia"/>
+              </w:rPr>
+              <w:t xml:space="preserve">拟制/修改日期</w:t>
+            </w:r>
+          </w:p>
+        </w:tc>
+        <w:tc>
+          <w:tcPr/>
+          <w:p>
+            <w:pPr>
+              <w:pStyle w:val="Compact"/>
+            </w:pPr>
+            <w:r>
+              <w:rPr>
+                <w:rFonts w:hint="eastAsia"/>
+              </w:rPr>
+              <w:t xml:space="preserve">版本</w:t>
+            </w:r>
+          </w:p>
+        </w:tc>
+        <w:tc>
+          <w:tcPr/>
+          <w:p>
+            <w:pPr>
+              <w:pStyle w:val="Compact"/>
+            </w:pPr>
+            <w:r>
+              <w:rPr>
+                <w:rFonts w:hint="eastAsia"/>
+              </w:rPr>
+              <w:t xml:space="preserve">说明</w:t>
+            </w:r>
+          </w:p>
+        </w:tc>
+        <w:tc>
+          <w:tcPr/>
+          <w:p>
+            <w:pPr>
+              <w:pStyle w:val="Compact"/>
+            </w:pPr>
+            <w:r>
+              <w:rPr>
+                <w:rFonts w:hint="eastAsia"/>
+              </w:rPr>
+              <w:t xml:space="preserve">拟制/修改人</w:t>
+            </w:r>
           </w:p>
         </w:tc>
       </w:tr>
@@ -385,72 +614,6 @@
               <w:pStyle w:val="Compact"/>
             </w:pPr>
             <w:r>
-              <w:rPr>
-                <w:rFonts w:hint="eastAsia"/>
-                <w:b/>
-                <w:bCs/>
-              </w:rPr>
-              <w:t xml:space="preserve">拟制/修改日期</w:t>
-            </w:r>
-          </w:p>
-        </w:tc>
-        <w:tc>
-          <w:tcPr/>
-          <w:p>
-            <w:pPr>
-              <w:pStyle w:val="Compact"/>
-            </w:pPr>
-            <w:r>
-              <w:rPr>
-                <w:rFonts w:hint="eastAsia"/>
-                <w:b/>
-                <w:bCs/>
-              </w:rPr>
-              <w:t xml:space="preserve">版本</w:t>
-            </w:r>
-          </w:p>
-        </w:tc>
-        <w:tc>
-          <w:tcPr/>
-          <w:p>
-            <w:pPr>
-              <w:pStyle w:val="Compact"/>
-            </w:pPr>
-            <w:r>
-              <w:rPr>
-                <w:rFonts w:hint="eastAsia"/>
-                <w:b/>
-                <w:bCs/>
-              </w:rPr>
-              <w:t xml:space="preserve">说明</w:t>
-            </w:r>
-          </w:p>
-        </w:tc>
-        <w:tc>
-          <w:tcPr/>
-          <w:p>
-            <w:pPr>
-              <w:pStyle w:val="Compact"/>
-            </w:pPr>
-            <w:r>
-              <w:rPr>
-                <w:rFonts w:hint="eastAsia"/>
-                <w:b/>
-                <w:bCs/>
-              </w:rPr>
-              <w:t xml:space="preserve">拟制/修改人</w:t>
-            </w:r>
-          </w:p>
-        </w:tc>
-      </w:tr>
-      <w:tr>
-        <w:tc>
-          <w:tcPr/>
-          <w:p>
-            <w:pPr>
-              <w:pStyle w:val="Compact"/>
-            </w:pPr>
-            <w:r>
               <w:t xml:space="preserve">2026-04-21</w:t>
             </w:r>
           </w:p>
@@ -487,299 +650,167 @@
               <w:pStyle w:val="Compact"/>
             </w:pPr>
             <w:r>
-              <w:rPr>
-                <w:rFonts w:hint="eastAsia"/>
-              </w:rPr>
-              <w:t xml:space="preserve">袁耿楠</w:t>
-            </w:r>
-          </w:p>
-        </w:tc>
-      </w:tr>
-      <w:tr>
-        <w:tc>
-          <w:tcPr/>
-          <w:p>
-            <w:pPr>
-              <w:pStyle w:val="Compact"/>
-            </w:pPr>
-          </w:p>
-        </w:tc>
-        <w:tc>
-          <w:tcPr/>
-          <w:p>
-            <w:pPr>
-              <w:pStyle w:val="Compact"/>
-            </w:pPr>
-          </w:p>
-        </w:tc>
-        <w:tc>
-          <w:tcPr/>
-          <w:p>
-            <w:pPr>
-              <w:pStyle w:val="Compact"/>
-            </w:pPr>
-          </w:p>
-        </w:tc>
-        <w:tc>
-          <w:tcPr/>
-          <w:p>
-            <w:pPr>
-              <w:pStyle w:val="Compact"/>
-            </w:pPr>
-          </w:p>
-        </w:tc>
-      </w:tr>
-      <w:tr>
-        <w:tc>
-          <w:tcPr/>
-          <w:p>
-            <w:pPr>
-              <w:pStyle w:val="Compact"/>
-            </w:pPr>
-          </w:p>
-        </w:tc>
-        <w:tc>
-          <w:tcPr/>
-          <w:p>
-            <w:pPr>
-              <w:pStyle w:val="Compact"/>
-            </w:pPr>
-          </w:p>
-        </w:tc>
-        <w:tc>
-          <w:tcPr/>
-          <w:p>
-            <w:pPr>
-              <w:pStyle w:val="Compact"/>
-            </w:pPr>
-          </w:p>
-        </w:tc>
-        <w:tc>
-          <w:tcPr/>
-          <w:p>
-            <w:pPr>
-              <w:pStyle w:val="Compact"/>
-            </w:pPr>
-          </w:p>
-        </w:tc>
-      </w:tr>
-      <w:tr>
-        <w:tc>
-          <w:tcPr/>
-          <w:p>
-            <w:pPr>
-              <w:pStyle w:val="Compact"/>
-            </w:pPr>
-          </w:p>
-        </w:tc>
-        <w:tc>
-          <w:tcPr/>
-          <w:p>
-            <w:pPr>
-              <w:pStyle w:val="Compact"/>
-            </w:pPr>
-          </w:p>
-        </w:tc>
-        <w:tc>
-          <w:tcPr/>
-          <w:p>
-            <w:pPr>
-              <w:pStyle w:val="Compact"/>
-            </w:pPr>
-          </w:p>
-        </w:tc>
-        <w:tc>
-          <w:tcPr/>
-          <w:p>
-            <w:pPr>
-              <w:pStyle w:val="Compact"/>
-            </w:pPr>
+              <w:t xml:space="preserve">ygn</w:t>
+            </w:r>
           </w:p>
         </w:tc>
       </w:tr>
     </w:tbl>
     <w:p>
+      <w:r>
+        <w:pict>
+          <v:rect style="width:0;height:1.5pt" o:hralign="center" o:hrstd="t" o:hr="t"/>
+        </w:pict>
+      </w:r>
+    </w:p>
+    <w:bookmarkEnd w:id="13"/>
+    <w:bookmarkStart w:id="14" w:name="目录"/>
+    <w:p>
+      <w:pPr>
+        <w:pStyle w:val="Heading1"/>
+      </w:pPr>
+      <w:r>
+        <w:rPr>
+          <w:rFonts w:hint="eastAsia"/>
+        </w:rPr>
+        <w:t xml:space="preserve">目录</w:t>
+      </w:r>
+    </w:p>
+    <w:p>
+      <w:pPr>
+        <w:pStyle w:val="FirstParagraph"/>
+      </w:pPr>
+      <w:r>
+        <w:t xml:space="preserve">::: {#TOC}</w:t>
+      </w:r>
+      <w:r>
+        <w:br/>
+      </w:r>
+      <w:r>
+        <w:t xml:space="preserve">:::</w:t>
+      </w:r>
+    </w:p>
+    <w:p>
+      <w:pPr>
+        <w:pStyle w:val="BlockText"/>
+      </w:pPr>
+      <w:r>
+        <w:t xml:space="preserve">Pandoc </w:t>
+      </w:r>
+      <w:r>
+        <w:rPr>
+          <w:rFonts w:hint="eastAsia"/>
+        </w:rPr>
+        <w:t xml:space="preserve">自动生成目录：使用</w:t>
+      </w:r>
+      <w:r>
+        <w:t xml:space="preserve"> </w:t>
+      </w:r>
+      <w:r>
+        <w:rPr>
+          <w:rStyle w:val="VerbatimChar"/>
+        </w:rPr>
+        <w:t xml:space="preserve">--toc</w:t>
+      </w:r>
+    </w:p>
+    <w:p>
+      <w:r>
+        <w:pict>
+          <v:rect style="width:0;height:1.5pt" o:hralign="center" o:hrstd="t" o:hr="t"/>
+        </w:pict>
+      </w:r>
+    </w:p>
+    <w:bookmarkEnd w:id="14"/>
+    <w:bookmarkStart w:id="19" w:name="简述"/>
+    <w:p>
+      <w:pPr>
+        <w:pStyle w:val="Heading1"/>
+      </w:pPr>
+      <w:r>
+        <w:t xml:space="preserve">1 </w:t>
+      </w:r>
+      <w:r>
+        <w:rPr>
+          <w:rFonts w:hint="eastAsia"/>
+        </w:rPr>
+        <w:t xml:space="preserve">简述</w:t>
+      </w:r>
+    </w:p>
+    <w:bookmarkStart w:id="15" w:name="文档说明"/>
+    <w:p>
+      <w:pPr>
+        <w:pStyle w:val="Heading2"/>
+      </w:pPr>
+      <w:r>
+        <w:t xml:space="preserve">1.1 </w:t>
+      </w:r>
+      <w:r>
+        <w:rPr>
+          <w:rFonts w:hint="eastAsia"/>
+        </w:rPr>
+        <w:t xml:space="preserve">文档说明</w:t>
+      </w:r>
+    </w:p>
+    <w:p>
+      <w:pPr>
+        <w:pStyle w:val="FirstParagraph"/>
+      </w:pPr>
+      <w:r>
+        <w:rPr>
+          <w:rFonts w:hint="eastAsia"/>
+        </w:rPr>
+        <w:t xml:space="preserve">本文档主要用于描述烽火台专户营销页面。</w:t>
+      </w:r>
+    </w:p>
+    <w:p>
       <w:pPr>
         <w:pStyle w:val="BodyText"/>
       </w:pPr>
       <w:r>
         <w:rPr>
           <w:rFonts w:hint="eastAsia"/>
-          <w:b/>
-          <w:bCs/>
-        </w:rPr>
-        <w:t xml:space="preserve">目录</w:t>
-      </w:r>
-    </w:p>
-    <w:p>
-      <w:pPr>
-        <w:pStyle w:val="BodyText"/>
-      </w:pPr>
-      <w:r>
-        <w:t xml:space="preserve">1.              </w:t>
-      </w:r>
-      <w:r>
-        <w:rPr>
-          <w:rFonts w:hint="eastAsia"/>
-        </w:rPr>
-        <w:t xml:space="preserve">简述...</w:t>
-      </w:r>
-      <w:r>
-        <w:t xml:space="preserve"> 4</w:t>
-      </w:r>
-    </w:p>
-    <w:p>
-      <w:pPr>
-        <w:pStyle w:val="BodyText"/>
-      </w:pPr>
-      <w:r>
-        <w:t xml:space="preserve">1.1            </w:t>
-      </w:r>
-      <w:r>
-        <w:rPr>
-          <w:rFonts w:hint="eastAsia"/>
-        </w:rPr>
-        <w:t xml:space="preserve">文档说明...</w:t>
-      </w:r>
-      <w:r>
-        <w:t xml:space="preserve"> 4</w:t>
-      </w:r>
-    </w:p>
-    <w:p>
-      <w:pPr>
-        <w:pStyle w:val="BodyText"/>
-      </w:pPr>
-      <w:r>
-        <w:t xml:space="preserve">1.2            </w:t>
-      </w:r>
-      <w:r>
-        <w:rPr>
-          <w:rFonts w:hint="eastAsia"/>
-        </w:rPr>
-        <w:t xml:space="preserve">名词和缩略语...</w:t>
-      </w:r>
-      <w:r>
-        <w:t xml:space="preserve"> 4</w:t>
-      </w:r>
-    </w:p>
-    <w:p>
-      <w:pPr>
-        <w:pStyle w:val="BodyText"/>
-      </w:pPr>
-      <w:r>
-        <w:t xml:space="preserve">2.              </w:t>
-      </w:r>
-      <w:r>
-        <w:rPr>
-          <w:rFonts w:hint="eastAsia"/>
-        </w:rPr>
-        <w:t xml:space="preserve">功能需求...</w:t>
-      </w:r>
-      <w:r>
-        <w:t xml:space="preserve"> 4</w:t>
-      </w:r>
-    </w:p>
-    <w:p>
-      <w:pPr>
-        <w:pStyle w:val="BodyText"/>
-      </w:pPr>
-      <w:r>
-        <w:t xml:space="preserve">2.1 </w:t>
-      </w:r>
-      <w:r>
-        <w:rPr>
-          <w:rFonts w:hint="eastAsia"/>
-        </w:rPr>
-        <w:t xml:space="preserve">烽火台新增调度项...</w:t>
-      </w:r>
-      <w:r>
-        <w:t xml:space="preserve"> 4</w:t>
-      </w:r>
-    </w:p>
-    <w:p>
-      <w:pPr>
-        <w:pStyle w:val="BodyText"/>
-      </w:pPr>
-      <w:r>
-        <w:t xml:space="preserve">2.1.1 </w:t>
-      </w:r>
-      <w:r>
-        <w:rPr>
-          <w:rFonts w:hint="eastAsia"/>
-        </w:rPr>
-        <w:t xml:space="preserve">债券回售及定存到期自动推送提醒流程...</w:t>
-      </w:r>
-      <w:r>
-        <w:t xml:space="preserve"> 4</w:t>
-      </w:r>
-    </w:p>
-    <w:bookmarkStart w:id="9" w:name="简述"/>
-    <w:p>
-      <w:pPr>
-        <w:pStyle w:val="Heading1"/>
-      </w:pPr>
-      <w:r>
-        <w:t xml:space="preserve">1. </w:t>
-      </w:r>
-      <w:r>
-        <w:rPr>
-          <w:rFonts w:hint="eastAsia"/>
-        </w:rPr>
-        <w:t xml:space="preserve">简述</w:t>
-      </w:r>
-    </w:p>
-    <w:bookmarkEnd w:id="9"/>
-    <w:bookmarkStart w:id="10" w:name="文档说明"/>
-    <w:p>
-      <w:pPr>
-        <w:pStyle w:val="Heading1"/>
-      </w:pPr>
-      <w:r>
-        <w:t xml:space="preserve">1.1   </w:t>
-      </w:r>
-      <w:r>
-        <w:rPr>
-          <w:rFonts w:hint="eastAsia"/>
-        </w:rPr>
-        <w:t xml:space="preserve">文档说明</w:t>
-      </w:r>
-    </w:p>
-    <w:p>
-      <w:pPr>
-        <w:pStyle w:val="FirstParagraph"/>
-      </w:pPr>
-      <w:r>
-        <w:t xml:space="preserve">       </w:t>
-      </w:r>
-      <w:r>
-        <w:rPr>
-          <w:rFonts w:hint="eastAsia"/>
-        </w:rPr>
-        <w:t xml:space="preserve">本文档主要用于描述烽火台专户营销页面。</w:t>
-      </w:r>
-    </w:p>
-    <w:p>
-      <w:pPr>
-        <w:pStyle w:val="BodyText"/>
-      </w:pPr>
-      <w:r>
-        <w:t xml:space="preserve">       </w:t>
-      </w:r>
-      <w:r>
-        <w:rPr>
-          <w:rFonts w:hint="eastAsia"/>
-        </w:rPr>
-        <w:t xml:space="preserve">本文档适用人员范围包括：开发测试人员、业务需求人员。</w:t>
-      </w:r>
-    </w:p>
-    <w:bookmarkEnd w:id="10"/>
-    <w:bookmarkStart w:id="11" w:name="名词和缩略语"/>
-    <w:p>
-      <w:pPr>
-        <w:pStyle w:val="Heading1"/>
-      </w:pPr>
-      <w:r>
-        <w:t xml:space="preserve">1.2   </w:t>
+        </w:rPr>
+        <w:t xml:space="preserve">本文档适用人员范围包括：</w:t>
+      </w:r>
+    </w:p>
+    <w:p>
+      <w:pPr>
+        <w:pStyle w:val="Compact"/>
+        <w:numPr>
+          <w:ilvl w:val="0"/>
+          <w:numId w:val="1001"/>
+        </w:numPr>
+      </w:pPr>
+      <w:r>
+        <w:rPr>
+          <w:rFonts w:hint="eastAsia"/>
+        </w:rPr>
+        <w:t xml:space="preserve">开发测试人员</w:t>
+      </w:r>
+    </w:p>
+    <w:p>
+      <w:pPr>
+        <w:pStyle w:val="Compact"/>
+        <w:numPr>
+          <w:ilvl w:val="0"/>
+          <w:numId w:val="1001"/>
+        </w:numPr>
+      </w:pPr>
+      <w:r>
+        <w:rPr>
+          <w:rFonts w:hint="eastAsia"/>
+        </w:rPr>
+        <w:t xml:space="preserve">业务需求人员</w:t>
+      </w:r>
+    </w:p>
+    <w:bookmarkEnd w:id="15"/>
+    <w:bookmarkStart w:id="18" w:name="名词和缩略语"/>
+    <w:p>
+      <w:pPr>
+        <w:pStyle w:val="Heading2"/>
+      </w:pPr>
+      <w:r>
+        <w:t xml:space="preserve">1.2 </w:t>
       </w:r>
       <w:r>
         <w:rPr>
@@ -788,15 +819,14 @@
         <w:t xml:space="preserve">名词和缩略语</w:t>
       </w:r>
     </w:p>
-    <w:p>
-      <w:pPr>
-        <w:pStyle w:val="FirstParagraph"/>
-      </w:pPr>
-      <w:r>
-        <w:rPr>
-          <w:rFonts w:hint="eastAsia"/>
-          <w:b/>
-          <w:bCs/>
+    <w:bookmarkStart w:id="16" w:name="名词"/>
+    <w:p>
+      <w:pPr>
+        <w:pStyle w:val="Heading3"/>
+      </w:pPr>
+      <w:r>
+        <w:rPr>
+          <w:rFonts w:hint="eastAsia"/>
         </w:rPr>
         <w:t xml:space="preserve">名词</w:t>
       </w:r>
@@ -866,15 +896,15 @@
         </w:tc>
       </w:tr>
     </w:tbl>
-    <w:p>
-      <w:pPr>
-        <w:pStyle w:val="BodyText"/>
-      </w:pPr>
-      <w:r>
-        <w:rPr>
-          <w:rFonts w:hint="eastAsia"/>
-          <w:b/>
-          <w:bCs/>
+    <w:bookmarkEnd w:id="16"/>
+    <w:bookmarkStart w:id="17" w:name="缩略语"/>
+    <w:p>
+      <w:pPr>
+        <w:pStyle w:val="Heading3"/>
+      </w:pPr>
+      <w:r>
+        <w:rPr>
+          <w:rFonts w:hint="eastAsia"/>
         </w:rPr>
         <w:t xml:space="preserve">缩略语</w:t>
       </w:r>
@@ -944,14 +974,23 @@
         </w:tc>
       </w:tr>
     </w:tbl>
-    <w:bookmarkEnd w:id="11"/>
-    <w:bookmarkStart w:id="12" w:name="功能需求"/>
+    <w:p>
+      <w:r>
+        <w:pict>
+          <v:rect style="width:0;height:1.5pt" o:hralign="center" o:hrstd="t" o:hr="t"/>
+        </w:pict>
+      </w:r>
+    </w:p>
+    <w:bookmarkEnd w:id="17"/>
+    <w:bookmarkEnd w:id="18"/>
+    <w:bookmarkEnd w:id="19"/>
+    <w:bookmarkStart w:id="27" w:name="功能需求"/>
     <w:p>
       <w:pPr>
         <w:pStyle w:val="Heading1"/>
       </w:pPr>
       <w:r>
-        <w:t xml:space="preserve">2. </w:t>
+        <w:t xml:space="preserve">2 </w:t>
       </w:r>
       <w:r>
         <w:rPr>
@@ -960,70 +999,575 @@
         <w:t xml:space="preserve">功能需求</w:t>
       </w:r>
     </w:p>
-    <w:bookmarkEnd w:id="12"/>
-    <w:bookmarkStart w:id="13" w:name="根据需求调整目前的目录结构"/>
+    <w:bookmarkStart w:id="20" w:name="根据需求调整目前的目录结构"/>
+    <w:p>
+      <w:pPr>
+        <w:pStyle w:val="Heading2"/>
+      </w:pPr>
+      <w:r>
+        <w:t xml:space="preserve">2.1 </w:t>
+      </w:r>
+      <w:r>
+        <w:rPr>
+          <w:rFonts w:hint="eastAsia"/>
+        </w:rPr>
+        <w:t xml:space="preserve">根据需求调整目前的目录结构</w:t>
+      </w:r>
+    </w:p>
+    <w:p>
+      <w:pPr>
+        <w:pStyle w:val="BlockText"/>
+      </w:pPr>
+      <w:r>
+        <w:rPr>
+          <w:rFonts w:hint="eastAsia"/>
+        </w:rPr>
+        <w:t xml:space="preserve">描述调整内容</w:t>
+      </w:r>
+    </w:p>
+    <w:p>
+      <w:r>
+        <w:pict>
+          <v:rect style="width:0;height:1.5pt" o:hralign="center" o:hrstd="t" o:hr="t"/>
+        </w:pict>
+      </w:r>
+    </w:p>
+    <w:bookmarkEnd w:id="20"/>
+    <w:bookmarkStart w:id="23" w:name="构建产品页"/>
+    <w:p>
+      <w:pPr>
+        <w:pStyle w:val="Heading2"/>
+      </w:pPr>
+      <w:r>
+        <w:t xml:space="preserve">2.2 </w:t>
+      </w:r>
+      <w:r>
+        <w:rPr>
+          <w:rFonts w:hint="eastAsia"/>
+        </w:rPr>
+        <w:t xml:space="preserve">构建产品页</w:t>
+      </w:r>
+    </w:p>
+    <w:p>
+      <w:pPr>
+        <w:pStyle w:val="BlockText"/>
+      </w:pPr>
+      <w:r>
+        <w:rPr>
+          <w:rFonts w:hint="eastAsia"/>
+        </w:rPr>
+        <w:t xml:space="preserve">描述页面结构、字段、接口</w:t>
+      </w:r>
+    </w:p>
+    <w:bookmarkStart w:id="21" w:name="页面结构"/>
+    <w:p>
+      <w:pPr>
+        <w:pStyle w:val="Heading3"/>
+      </w:pPr>
+      <w:r>
+        <w:t xml:space="preserve">2.2.1 </w:t>
+      </w:r>
+      <w:r>
+        <w:rPr>
+          <w:rFonts w:hint="eastAsia"/>
+        </w:rPr>
+        <w:t xml:space="preserve">页面结构</w:t>
+      </w:r>
+    </w:p>
+    <w:p>
+      <w:pPr>
+        <w:pStyle w:val="Compact"/>
+        <w:numPr>
+          <w:ilvl w:val="0"/>
+          <w:numId w:val="1002"/>
+        </w:numPr>
+      </w:pPr>
+      <w:r>
+        <w:rPr>
+          <w:rFonts w:hint="eastAsia"/>
+        </w:rPr>
+        <w:t xml:space="preserve">模块1：</w:t>
+      </w:r>
+    </w:p>
+    <w:p>
+      <w:pPr>
+        <w:pStyle w:val="Compact"/>
+        <w:numPr>
+          <w:ilvl w:val="0"/>
+          <w:numId w:val="1002"/>
+        </w:numPr>
+      </w:pPr>
+      <w:r>
+        <w:rPr>
+          <w:rFonts w:hint="eastAsia"/>
+        </w:rPr>
+        <w:t xml:space="preserve">模块2：</w:t>
+      </w:r>
+    </w:p>
+    <w:bookmarkEnd w:id="21"/>
+    <w:bookmarkStart w:id="22" w:name="数据来源"/>
+    <w:p>
+      <w:pPr>
+        <w:pStyle w:val="Heading3"/>
+      </w:pPr>
+      <w:r>
+        <w:t xml:space="preserve">2.2.2 </w:t>
+      </w:r>
+      <w:r>
+        <w:rPr>
+          <w:rFonts w:hint="eastAsia"/>
+        </w:rPr>
+        <w:t xml:space="preserve">数据来源</w:t>
+      </w:r>
+    </w:p>
+    <w:tbl>
+      <w:tblPr>
+        <w:tblStyle w:val="Table"/>
+        <w:tblW w:type="auto" w:w="0"/>
+        <w:tblLook w:firstRow="1" w:lastRow="0" w:firstColumn="0" w:lastColumn="0" w:noHBand="0" w:noVBand="0" w:val="0020"/>
+      </w:tblPr>
+      <w:tblGrid>
+        <w:gridCol w:w="2640"/>
+        <w:gridCol w:w="2640"/>
+        <w:gridCol w:w="2640"/>
+      </w:tblGrid>
+      <w:tr>
+        <w:trPr>
+          <w:tblHeader w:val="on"/>
+        </w:trPr>
+        <w:tc>
+          <w:tcPr/>
+          <w:p>
+            <w:pPr>
+              <w:pStyle w:val="Compact"/>
+            </w:pPr>
+            <w:r>
+              <w:rPr>
+                <w:rFonts w:hint="eastAsia"/>
+              </w:rPr>
+              <w:t xml:space="preserve">字段</w:t>
+            </w:r>
+          </w:p>
+        </w:tc>
+        <w:tc>
+          <w:tcPr/>
+          <w:p>
+            <w:pPr>
+              <w:pStyle w:val="Compact"/>
+            </w:pPr>
+            <w:r>
+              <w:rPr>
+                <w:rFonts w:hint="eastAsia"/>
+              </w:rPr>
+              <w:t xml:space="preserve">来源</w:t>
+            </w:r>
+          </w:p>
+        </w:tc>
+        <w:tc>
+          <w:tcPr/>
+          <w:p>
+            <w:pPr>
+              <w:pStyle w:val="Compact"/>
+            </w:pPr>
+            <w:r>
+              <w:rPr>
+                <w:rFonts w:hint="eastAsia"/>
+              </w:rPr>
+              <w:t xml:space="preserve">说明</w:t>
+            </w:r>
+          </w:p>
+        </w:tc>
+      </w:tr>
+      <w:tr>
+        <w:tc>
+          <w:tcPr/>
+          <w:p>
+            <w:pPr>
+              <w:pStyle w:val="Compact"/>
+            </w:pPr>
+          </w:p>
+        </w:tc>
+        <w:tc>
+          <w:tcPr/>
+          <w:p>
+            <w:pPr>
+              <w:pStyle w:val="Compact"/>
+            </w:pPr>
+          </w:p>
+        </w:tc>
+        <w:tc>
+          <w:tcPr/>
+          <w:p>
+            <w:pPr>
+              <w:pStyle w:val="Compact"/>
+            </w:pPr>
+          </w:p>
+        </w:tc>
+      </w:tr>
+    </w:tbl>
+    <w:p>
+      <w:r>
+        <w:pict>
+          <v:rect style="width:0;height:1.5pt" o:hralign="center" o:hrstd="t" o:hr="t"/>
+        </w:pict>
+      </w:r>
+    </w:p>
+    <w:bookmarkEnd w:id="22"/>
+    <w:bookmarkEnd w:id="23"/>
+    <w:bookmarkStart w:id="26" w:name="构建产品详情页"/>
+    <w:p>
+      <w:pPr>
+        <w:pStyle w:val="Heading2"/>
+      </w:pPr>
+      <w:r>
+        <w:t xml:space="preserve">2.3 </w:t>
+      </w:r>
+      <w:r>
+        <w:rPr>
+          <w:rFonts w:hint="eastAsia"/>
+        </w:rPr>
+        <w:t xml:space="preserve">构建产品详情页</w:t>
+      </w:r>
+    </w:p>
+    <w:p>
+      <w:pPr>
+        <w:pStyle w:val="BlockText"/>
+      </w:pPr>
+      <w:r>
+        <w:rPr>
+          <w:rFonts w:hint="eastAsia"/>
+        </w:rPr>
+        <w:t xml:space="preserve">描述详情页逻辑</w:t>
+      </w:r>
+    </w:p>
+    <w:bookmarkStart w:id="24" w:name="页面结构-1"/>
+    <w:p>
+      <w:pPr>
+        <w:pStyle w:val="Heading3"/>
+      </w:pPr>
+      <w:r>
+        <w:t xml:space="preserve">2.3.1 </w:t>
+      </w:r>
+      <w:r>
+        <w:rPr>
+          <w:rFonts w:hint="eastAsia"/>
+        </w:rPr>
+        <w:t xml:space="preserve">页面结构</w:t>
+      </w:r>
+    </w:p>
+    <w:p>
+      <w:pPr>
+        <w:pStyle w:val="Compact"/>
+        <w:numPr>
+          <w:ilvl w:val="0"/>
+          <w:numId w:val="1003"/>
+        </w:numPr>
+      </w:pPr>
+      <w:r>
+        <w:rPr>
+          <w:rFonts w:hint="eastAsia"/>
+        </w:rPr>
+        <w:t xml:space="preserve">基本信息</w:t>
+      </w:r>
+    </w:p>
+    <w:p>
+      <w:pPr>
+        <w:pStyle w:val="Compact"/>
+        <w:numPr>
+          <w:ilvl w:val="0"/>
+          <w:numId w:val="1003"/>
+        </w:numPr>
+      </w:pPr>
+      <w:r>
+        <w:rPr>
+          <w:rFonts w:hint="eastAsia"/>
+        </w:rPr>
+        <w:t xml:space="preserve">产品要素</w:t>
+      </w:r>
+    </w:p>
+    <w:p>
+      <w:pPr>
+        <w:pStyle w:val="Compact"/>
+        <w:numPr>
+          <w:ilvl w:val="0"/>
+          <w:numId w:val="1003"/>
+        </w:numPr>
+      </w:pPr>
+      <w:r>
+        <w:rPr>
+          <w:rFonts w:hint="eastAsia"/>
+        </w:rPr>
+        <w:t xml:space="preserve">风险指标</w:t>
+      </w:r>
+    </w:p>
+    <w:bookmarkEnd w:id="24"/>
+    <w:bookmarkStart w:id="25" w:name="接口定义"/>
+    <w:p>
+      <w:pPr>
+        <w:pStyle w:val="Heading3"/>
+      </w:pPr>
+      <w:r>
+        <w:t xml:space="preserve">2.3.2 </w:t>
+      </w:r>
+      <w:r>
+        <w:rPr>
+          <w:rFonts w:hint="eastAsia"/>
+        </w:rPr>
+        <w:t xml:space="preserve">接口定义</w:t>
+      </w:r>
+    </w:p>
+    <w:tbl>
+      <w:tblPr>
+        <w:tblStyle w:val="Table"/>
+        <w:tblW w:type="auto" w:w="0"/>
+        <w:tblLook w:firstRow="1" w:lastRow="0" w:firstColumn="0" w:lastColumn="0" w:noHBand="0" w:noVBand="0" w:val="0020"/>
+      </w:tblPr>
+      <w:tblGrid>
+        <w:gridCol w:w="1980"/>
+        <w:gridCol w:w="1980"/>
+        <w:gridCol w:w="1980"/>
+        <w:gridCol w:w="1980"/>
+      </w:tblGrid>
+      <w:tr>
+        <w:trPr>
+          <w:tblHeader w:val="on"/>
+        </w:trPr>
+        <w:tc>
+          <w:tcPr/>
+          <w:p>
+            <w:pPr>
+              <w:pStyle w:val="Compact"/>
+            </w:pPr>
+            <w:r>
+              <w:rPr>
+                <w:rFonts w:hint="eastAsia"/>
+              </w:rPr>
+              <w:t xml:space="preserve">接口名称</w:t>
+            </w:r>
+          </w:p>
+        </w:tc>
+        <w:tc>
+          <w:tcPr/>
+          <w:p>
+            <w:pPr>
+              <w:pStyle w:val="Compact"/>
+            </w:pPr>
+            <w:r>
+              <w:t xml:space="preserve">URL</w:t>
+            </w:r>
+          </w:p>
+        </w:tc>
+        <w:tc>
+          <w:tcPr/>
+          <w:p>
+            <w:pPr>
+              <w:pStyle w:val="Compact"/>
+            </w:pPr>
+            <w:r>
+              <w:rPr>
+                <w:rFonts w:hint="eastAsia"/>
+              </w:rPr>
+              <w:t xml:space="preserve">方法</w:t>
+            </w:r>
+          </w:p>
+        </w:tc>
+        <w:tc>
+          <w:tcPr/>
+          <w:p>
+            <w:pPr>
+              <w:pStyle w:val="Compact"/>
+            </w:pPr>
+            <w:r>
+              <w:rPr>
+                <w:rFonts w:hint="eastAsia"/>
+              </w:rPr>
+              <w:t xml:space="preserve">说明</w:t>
+            </w:r>
+          </w:p>
+        </w:tc>
+      </w:tr>
+      <w:tr>
+        <w:tc>
+          <w:tcPr/>
+          <w:p>
+            <w:pPr>
+              <w:pStyle w:val="Compact"/>
+            </w:pPr>
+          </w:p>
+        </w:tc>
+        <w:tc>
+          <w:tcPr/>
+          <w:p>
+            <w:pPr>
+              <w:pStyle w:val="Compact"/>
+            </w:pPr>
+          </w:p>
+        </w:tc>
+        <w:tc>
+          <w:tcPr/>
+          <w:p>
+            <w:pPr>
+              <w:pStyle w:val="Compact"/>
+            </w:pPr>
+          </w:p>
+        </w:tc>
+        <w:tc>
+          <w:tcPr/>
+          <w:p>
+            <w:pPr>
+              <w:pStyle w:val="Compact"/>
+            </w:pPr>
+          </w:p>
+        </w:tc>
+      </w:tr>
+    </w:tbl>
+    <w:p>
+      <w:r>
+        <w:pict>
+          <v:rect style="width:0;height:1.5pt" o:hralign="center" o:hrstd="t" o:hr="t"/>
+        </w:pict>
+      </w:r>
+    </w:p>
+    <w:bookmarkEnd w:id="25"/>
+    <w:bookmarkEnd w:id="26"/>
+    <w:bookmarkEnd w:id="27"/>
+    <w:bookmarkStart w:id="29" w:name="附录可选"/>
     <w:p>
       <w:pPr>
         <w:pStyle w:val="Heading1"/>
       </w:pPr>
       <w:r>
-        <w:t xml:space="preserve">2.1   </w:t>
-      </w:r>
-      <w:r>
-        <w:rPr>
-          <w:rFonts w:hint="eastAsia"/>
-        </w:rPr>
-        <w:t xml:space="preserve">根据需求调整目前的目录结构</w:t>
-      </w:r>
-    </w:p>
-    <w:p>
-      <w:pPr>
-        <w:pStyle w:val="FirstParagraph"/>
-      </w:pPr>
-    </w:p>
-    <w:bookmarkEnd w:id="13"/>
-    <w:bookmarkStart w:id="14" w:name="构建产品页"/>
-    <w:p>
-      <w:pPr>
-        <w:pStyle w:val="Heading1"/>
-      </w:pPr>
-      <w:r>
-        <w:t xml:space="preserve">2.2   </w:t>
-      </w:r>
-      <w:r>
-        <w:rPr>
-          <w:rFonts w:hint="eastAsia"/>
-        </w:rPr>
-        <w:t xml:space="preserve">构建产品页</w:t>
-      </w:r>
-    </w:p>
-    <w:p>
-      <w:pPr>
-        <w:pStyle w:val="FirstParagraph"/>
-      </w:pPr>
-    </w:p>
-    <w:bookmarkEnd w:id="14"/>
-    <w:bookmarkStart w:id="15" w:name="构建产品详情页"/>
-    <w:p>
-      <w:pPr>
-        <w:pStyle w:val="Heading1"/>
-      </w:pPr>
-      <w:r>
-        <w:t xml:space="preserve">2.3   </w:t>
-      </w:r>
-      <w:r>
-        <w:rPr>
-          <w:rFonts w:hint="eastAsia"/>
-        </w:rPr>
-        <w:t xml:space="preserve">构建产品详情页</w:t>
-      </w:r>
-    </w:p>
-    <w:p>
-      <w:pPr>
-        <w:pStyle w:val="FirstParagraph"/>
-      </w:pPr>
-    </w:p>
-    <w:bookmarkEnd w:id="15"/>
+        <w:rPr>
+          <w:rFonts w:hint="eastAsia"/>
+        </w:rPr>
+        <w:t xml:space="preserve">附录（可选）</w:t>
+      </w:r>
+    </w:p>
+    <w:bookmarkStart w:id="28" w:name="a.-接口字段定义"/>
+    <w:p>
+      <w:pPr>
+        <w:pStyle w:val="Heading2"/>
+      </w:pPr>
+      <w:r>
+        <w:t xml:space="preserve">A. </w:t>
+      </w:r>
+      <w:r>
+        <w:rPr>
+          <w:rFonts w:hint="eastAsia"/>
+        </w:rPr>
+        <w:t xml:space="preserve">接口字段定义</w:t>
+      </w:r>
+    </w:p>
+    <w:tbl>
+      <w:tblPr>
+        <w:tblStyle w:val="Table"/>
+        <w:tblW w:type="auto" w:w="0"/>
+        <w:tblLook w:firstRow="1" w:lastRow="0" w:firstColumn="0" w:lastColumn="0" w:noHBand="0" w:noVBand="0" w:val="0020"/>
+      </w:tblPr>
+      <w:tblGrid>
+        <w:gridCol w:w="1980"/>
+        <w:gridCol w:w="1980"/>
+        <w:gridCol w:w="1980"/>
+        <w:gridCol w:w="1980"/>
+      </w:tblGrid>
+      <w:tr>
+        <w:trPr>
+          <w:tblHeader w:val="on"/>
+        </w:trPr>
+        <w:tc>
+          <w:tcPr/>
+          <w:p>
+            <w:pPr>
+              <w:pStyle w:val="Compact"/>
+            </w:pPr>
+            <w:r>
+              <w:rPr>
+                <w:rFonts w:hint="eastAsia"/>
+              </w:rPr>
+              <w:t xml:space="preserve">字段名</w:t>
+            </w:r>
+          </w:p>
+        </w:tc>
+        <w:tc>
+          <w:tcPr/>
+          <w:p>
+            <w:pPr>
+              <w:pStyle w:val="Compact"/>
+            </w:pPr>
+            <w:r>
+              <w:rPr>
+                <w:rFonts w:hint="eastAsia"/>
+              </w:rPr>
+              <w:t xml:space="preserve">类型</w:t>
+            </w:r>
+          </w:p>
+        </w:tc>
+        <w:tc>
+          <w:tcPr/>
+          <w:p>
+            <w:pPr>
+              <w:pStyle w:val="Compact"/>
+            </w:pPr>
+            <w:r>
+              <w:rPr>
+                <w:rFonts w:hint="eastAsia"/>
+              </w:rPr>
+              <w:t xml:space="preserve">是否必填</w:t>
+            </w:r>
+          </w:p>
+        </w:tc>
+        <w:tc>
+          <w:tcPr/>
+          <w:p>
+            <w:pPr>
+              <w:pStyle w:val="Compact"/>
+            </w:pPr>
+            <w:r>
+              <w:rPr>
+                <w:rFonts w:hint="eastAsia"/>
+              </w:rPr>
+              <w:t xml:space="preserve">说明</w:t>
+            </w:r>
+          </w:p>
+        </w:tc>
+      </w:tr>
+      <w:tr>
+        <w:tc>
+          <w:tcPr/>
+          <w:p>
+            <w:pPr>
+              <w:pStyle w:val="Compact"/>
+            </w:pPr>
+          </w:p>
+        </w:tc>
+        <w:tc>
+          <w:tcPr/>
+          <w:p>
+            <w:pPr>
+              <w:pStyle w:val="Compact"/>
+            </w:pPr>
+          </w:p>
+        </w:tc>
+        <w:tc>
+          <w:tcPr/>
+          <w:p>
+            <w:pPr>
+              <w:pStyle w:val="Compact"/>
+            </w:pPr>
+          </w:p>
+        </w:tc>
+        <w:tc>
+          <w:tcPr/>
+          <w:p>
+            <w:pPr>
+              <w:pStyle w:val="Compact"/>
+            </w:pPr>
+          </w:p>
+        </w:tc>
+      </w:tr>
+    </w:tbl>
+    <w:bookmarkEnd w:id="28"/>
+    <w:bookmarkEnd w:id="29"/>
     <w:sectPr>
       <w:footnotePr>
         <w:numRestart w:val="eachSect"/>
@@ -1134,8 +1678,120 @@
       </w:pPr>
     </w:lvl>
   </w:abstractNum>
+  <w:abstractNum w:abstractNumId="991">
+    <w:nsid w:val="0000A991"/>
+    <w:multiLevelType w:val="multilevel"/>
+    <w:lvl w:ilvl="0">
+      <w:numFmt w:val="bullet"/>
+      <w:lvlText w:val=""/>
+      <w:lvlJc w:val="left"/>
+      <w:pPr>
+        <w:ind w:left="720" w:hanging="360"/>
+      </w:pPr>
+      <w:rPr>
+        <w:rFonts w:ascii="Symbol" w:hAnsi="Symbol" w:cs="Symbol" w:hint="default"/>
+      </w:rPr>
+    </w:lvl>
+    <w:lvl w:ilvl="1">
+      <w:numFmt w:val="bullet"/>
+      <w:lvlText w:val="o"/>
+      <w:lvlJc w:val="left"/>
+      <w:pPr>
+        <w:ind w:left="1440" w:hanging="360"/>
+      </w:pPr>
+      <w:rPr>
+        <w:rFonts w:ascii="Courier New" w:hAnsi="Courier New" w:cs="Courier New" w:hint="default"/>
+      </w:rPr>
+    </w:lvl>
+    <w:lvl w:ilvl="2">
+      <w:numFmt w:val="bullet"/>
+      <w:lvlText w:val=""/>
+      <w:lvlJc w:val="left"/>
+      <w:pPr>
+        <w:ind w:left="2160" w:hanging="360"/>
+      </w:pPr>
+      <w:rPr>
+        <w:rFonts w:ascii="Wingdings" w:hAnsi="Wingdings" w:cs="Wingdings" w:hint="default"/>
+      </w:rPr>
+    </w:lvl>
+    <w:lvl w:ilvl="3">
+      <w:numFmt w:val="bullet"/>
+      <w:lvlText w:val=""/>
+      <w:lvlJc w:val="left"/>
+      <w:pPr>
+        <w:ind w:left="2880" w:hanging="360"/>
+      </w:pPr>
+      <w:rPr>
+        <w:rFonts w:ascii="Symbol" w:hAnsi="Symbol" w:cs="Symbol" w:hint="default"/>
+      </w:rPr>
+    </w:lvl>
+    <w:lvl w:ilvl="4">
+      <w:numFmt w:val="bullet"/>
+      <w:lvlText w:val="o"/>
+      <w:lvlJc w:val="left"/>
+      <w:pPr>
+        <w:ind w:left="3600" w:hanging="360"/>
+      </w:pPr>
+      <w:rPr>
+        <w:rFonts w:ascii="Courier New" w:hAnsi="Courier New" w:cs="Courier New" w:hint="default"/>
+      </w:rPr>
+    </w:lvl>
+    <w:lvl w:ilvl="5">
+      <w:numFmt w:val="bullet"/>
+      <w:lvlText w:val=""/>
+      <w:lvlJc w:val="left"/>
+      <w:pPr>
+        <w:ind w:left="4320" w:hanging="360"/>
+      </w:pPr>
+      <w:rPr>
+        <w:rFonts w:ascii="Wingdings" w:hAnsi="Wingdings" w:cs="Wingdings" w:hint="default"/>
+      </w:rPr>
+    </w:lvl>
+    <w:lvl w:ilvl="6">
+      <w:numFmt w:val="bullet"/>
+      <w:lvlText w:val=""/>
+      <w:lvlJc w:val="left"/>
+      <w:pPr>
+        <w:ind w:left="5040" w:hanging="360"/>
+      </w:pPr>
+      <w:rPr>
+        <w:rFonts w:ascii="Symbol" w:hAnsi="Symbol" w:cs="Symbol" w:hint="default"/>
+      </w:rPr>
+    </w:lvl>
+    <w:lvl w:ilvl="7">
+      <w:numFmt w:val="bullet"/>
+      <w:lvlText w:val="o"/>
+      <w:lvlJc w:val="left"/>
+      <w:pPr>
+        <w:ind w:left="5760" w:hanging="360"/>
+      </w:pPr>
+      <w:rPr>
+        <w:rFonts w:ascii="Courier New" w:hAnsi="Courier New" w:cs="Courier New" w:hint="default"/>
+      </w:rPr>
+    </w:lvl>
+    <w:lvl w:ilvl="8">
+      <w:numFmt w:val="bullet"/>
+      <w:lvlText w:val=""/>
+      <w:lvlJc w:val="left"/>
+      <w:pPr>
+        <w:ind w:left="6480" w:hanging="360"/>
+      </w:pPr>
+      <w:rPr>
+        <w:rFonts w:ascii="Wingdings" w:hAnsi="Wingdings" w:cs="Wingdings" w:hint="default"/>
+      </w:rPr>
+    </w:lvl>
+  </w:abstractNum>
   <w:num w:numId="1000">
     <w:abstractNumId w:val="990"/>
+  </w:num>
+  <w:num w:numId="1001">
+    <w:abstractNumId w:val="991"/>
+  </w:num>
+  <w:num w:numId="1002">
+    <w:abstractNumId w:val="991"/>
+  </w:num>
+  <w:num w:numId="1003">
+    <w:abstractNumId w:val="991"/>
   </w:num>
 </w:numbering>
 </file>

</xml_diff>